<commit_message>
Speech v3: lively but substantive; memo + docx updated
Co-authored-by: arena-agent <297053741+arena-agent@users.noreply.github.com>
</commit_message>
<xml_diff>
--- a/Памятка_защита.docx
+++ b/Памятка_защита.docx
@@ -249,7 +249,7 @@
               <w:rPr>
                 <w:sz w:val="21"/>
               </w:rPr>
-              <w:t>1:00</w:t>
+              <w:t>1:05</w:t>
             </w:r>
           </w:p>
         </w:tc>
@@ -397,7 +397,7 @@
               <w:rPr>
                 <w:sz w:val="21"/>
               </w:rPr>
-              <w:t>1:00</w:t>
+              <w:t>1:25</w:t>
             </w:r>
           </w:p>
         </w:tc>
@@ -471,7 +471,7 @@
               <w:rPr>
                 <w:sz w:val="21"/>
               </w:rPr>
-              <w:t>1:15</w:t>
+              <w:t>1:20</w:t>
             </w:r>
           </w:p>
         </w:tc>
@@ -557,7 +557,7 @@
         <w:spacing w:after="120"/>
       </w:pPr>
       <w:r>
-        <w:t>Итого около 5,5 минут. Слайды листает один человек (спикер 4), остальные к ноутбуку не подходят.</w:t>
+        <w:t>Итого около 6 минут. Слайды листает один человек (спикер 4), остальные к ноутбуку не подходят.</w:t>
       </w:r>
     </w:p>
     <w:p>
@@ -573,53 +573,10 @@
     </w:p>
     <w:p>
       <w:pPr>
-        <w:pStyle w:val="Heading2"/>
-      </w:pPr>
-      <w:r>
-        <w:rPr>
-          <w:color w:val="0B3D91"/>
-        </w:rPr>
-        <w:t>1. Капитан — «Зачем»</w:t>
-      </w:r>
-    </w:p>
-    <w:p>
-      <w:pPr>
         <w:spacing w:after="120"/>
       </w:pPr>
       <w:r>
-        <w:t>Добрый день. Мы — команда «Победное очко».</w:t>
-      </w:r>
-    </w:p>
-    <w:p>
-      <w:pPr>
-        <w:spacing w:after="120"/>
-      </w:pPr>
-      <w:r>
-        <w:t>Начну с картинки, которую многие помнят: 2013 год, Амур, под водой сёла, дороги и поля. Когда такое случается, у спасателей один главный вопрос: где именно сейчас вода и сколько её. И ответ нужен за часы, а не за дни.</w:t>
-      </w:r>
-    </w:p>
-    <w:p>
-      <w:pPr>
-        <w:spacing w:after="120"/>
-      </w:pPr>
-      <w:r>
-        <w:t>Спутники снимают Амур каждые несколько дней, но сами по себе снимки — это просто картинки. Мы сделали программу, которая превращает их в ответ. Она берёт два снимка — до паводка и в его пик — и показывает, где вода была, где стала и где пришла заново. И считает площадь в гектарах.</w:t>
-      </w:r>
-    </w:p>
-    <w:p>
-      <w:pPr>
-        <w:spacing w:after="120"/>
-      </w:pPr>
-      <w:r>
-        <w:t>По оценке организаторов наша программа набрала 0,768 — это почти 77 процентов от максимума.</w:t>
-      </w:r>
-    </w:p>
-    <w:p>
-      <w:pPr>
-        <w:spacing w:after="120"/>
-      </w:pPr>
-      <w:r>
-        <w:t>Почему это оказалось непросто и как мы это сделали — расскажет [имя].</w:t>
+        <w:t>Живой рассказ с сутью для экспертов, около 6 минут. Если лимит 5 минут — убрать фразы, помеченные ⟨так⟩.</w:t>
       </w:r>
     </w:p>
     <w:p>
@@ -630,7 +587,7 @@
         <w:rPr>
           <w:color w:val="0B3D91"/>
         </w:rPr>
-        <w:t>2. Модель — «Как»</w:t>
+        <w:t>1. Капитан — «Зачем и с чем работаем» (1:05, слайды 1–3)</w:t>
       </w:r>
     </w:p>
     <w:p>
@@ -638,7 +595,7 @@
         <w:spacing w:after="120"/>
       </w:pPr>
       <w:r>
-        <w:t>Спасибо. Казалось бы, что тут сложного: вода на снимке тёмная, суша светлая — проведи границу и вычти один снимок из другого. Мы с этого и начали. И это не сработало.</w:t>
+        <w:t>Добрый день! Мы — команда «Победное очко», и мы сделали HydroWatch Amur.</w:t>
       </w:r>
     </w:p>
     <w:p>
@@ -646,7 +603,7 @@
         <w:spacing w:after="120"/>
       </w:pPr>
       <w:r>
-        <w:t>Радар видит сквозь облака, но ветер на воде делает её похожей на сушу, а тени от гор — похожими на воду. Обычный снимок точнее, но у половины наших пар его просто нет — облака. А между двумя снимками полтора месяца, за которые река меняется и без всякого паводка.</w:t>
+        <w:t>2013 год, Амур: под водой сёла, дороги, поля. У спасателей в такие дни один вопрос — где сейчас вода и сколько её, и ответ нужен за часы. Спутники снимают Амур каждые несколько дней, но снимок — это ещё не ответ. Наша программа берёт пару снимков — «до» паводка и на его «пике» — и выдаёт три карты: вода до, вода на пике и новое затопление, плюс площади в гектарах. По оценке организаторов — 0,768.</w:t>
       </w:r>
     </w:p>
     <w:p>
@@ -654,7 +611,7 @@
         <w:spacing w:after="120"/>
       </w:pPr>
       <w:r>
-        <w:t>Поэтому мы поступили иначе. Мы не вычитаем готовые карты, а даём нейросети оба снимка сразу — и радар, и оптику — плюс карту рельефа, потому что вода собирается там, где низко. Сеть сама учится сравнивать «до» и «после».</w:t>
+        <w:t>Три факта про данные, которые определили всё решение. Первый: новое затопление занимает от 0,02 до 2 процентов сцены — иголка в стоге сена. Второй: у пяти пар из одиннадцати оптики нет вообще, только радар. И третий: между «до» и «пиком» шесть недель, ⟨а радар и оптика разнесены ещё до пяти суток,⟩ — простое вычитание карт ловит не паводок, а сезон.</w:t>
       </w:r>
     </w:p>
     <w:p>
@@ -662,15 +619,7 @@
         <w:spacing w:after="120"/>
       </w:pPr>
       <w:r>
-        <w:t>Три решения, которые дали результат. Первое: пока мы учили сеть, в половине случаев прятали от неё оптику — поэтому когда оптики нет, она не теряется. Второе: мы объяснили сети правила: новая вода может быть только там, где в пик вода есть, а до паводка её не было. Третье: новую воду сеть ищет как отдельную задачу, а не как разность двух карт.</w:t>
-      </w:r>
-    </w:p>
-    <w:p>
-      <w:pPr>
-        <w:spacing w:after="120"/>
-      </w:pPr>
-      <w:r>
-        <w:t>Почему это важно — сейчас покажет [имя]. Оказалось, что даже правильные ответы организаторов между собой не сходятся.</w:t>
+        <w:t>Как мы с этим справились — [имя].</w:t>
       </w:r>
     </w:p>
     <w:p>
@@ -681,7 +630,7 @@
         <w:rPr>
           <w:color w:val="0B3D91"/>
         </w:rPr>
-        <w:t>3. Проверка — «Откуда мы знаем, что это работает»</w:t>
+        <w:t>2. Модель — «Как устроено» (1:30, слайды 4–5)</w:t>
       </w:r>
     </w:p>
     <w:p>
@@ -689,7 +638,7 @@
         <w:spacing w:after="120"/>
       </w:pPr>
       <w:r>
-        <w:t>Любая модель хорошо работает на том, на чём училась. Поэтому одно событие — паводок 2021 года на Зее — мы полностью отложили и ни разу не показывали сети. На нём честная цифра: новая вода найдена на 53 процента, вода в пик — на 57, вода до паводка — на 100. Все настройки мы подбирали только на этом событии.</w:t>
+        <w:t>Начали мы, как все, с классики: порог Оцу по радару и разность масок. Не сработало, и понятно почему. У радара ветровая рябь на воде выглядит как суша, а радиотени от гор — как вода. У оптики свои беды — мутная вода и тени. Важно, что эти ошибки не совпадают. Значит, объединять модальности нужно не на уровне готовых масок, а на уровне признаков, внутри одной сети.</w:t>
       </w:r>
     </w:p>
     <w:p>
@@ -697,7 +646,7 @@
         <w:spacing w:after="120"/>
       </w:pPr>
       <w:r>
-        <w:t>По всем данным мы насчитали 0,758, сайт показал 0,768 — наша оценка совпала с официальной.</w:t>
+        <w:t>Так появилась наша архитектура — сиамская мультимодальная U-Net. Две ветки-энкодера ResNet-18: одна читает радар, вторая — оптику. Каждая смотрит и на «до», и на «пик», и на каждом уровне мы формируем временные признаки: было, стало, разность. Добавляем рельеф — высоту над ближайшей рекой, уклон, карту постоянной воды — и флаг: есть ли оптика вообще. Декодер выдаёт три карты.</w:t>
       </w:r>
     </w:p>
     <w:p>
@@ -705,7 +654,7 @@
         <w:spacing w:after="120"/>
       </w:pPr>
       <w:r>
-        <w:t>Но самое интересное мы нашли, когда проверили сами эталонные ответы. У пяти пар из одиннадцати в «правильной» карте нет реки: там, где река шириной в километры, размечено 30 гектаров воды. По Зее таблица и карта расходятся на 14 процентов. И «новая вода» в разметке не равна «пик минус до». Вот почему мы учим новую воду отдельной задачей — эту разметку нельзя получить арифметикой.</w:t>
+        <w:t>Три решения, которые дали результат. Первое — modality dropout: при обучении в половине батчей мы выключали оптику, поэтому пары без неё для сети — норма, а не авария. Второе — функция потерь под дисбаланс: focal Tversky плюс штраф за площадь плюс гидрологические правила — затопление может быть только внутри воды пика и вне воды «до». Третье — новое затопление предсказывает отдельная голова, а не разность масок.</w:t>
       </w:r>
     </w:p>
     <w:p>
@@ -713,7 +662,7 @@
         <w:spacing w:after="120"/>
       </w:pPr>
       <w:r>
-        <w:t>Но модель — это только половина дела. Спасателю нужна не нейросеть, а карта и цифры. Об этом — [имя].</w:t>
+        <w:t>Почему это принципиально — сейчас покажет [имя]: оказалось, что даже эталон разности не равен.</w:t>
       </w:r>
     </w:p>
     <w:p>
@@ -724,7 +673,7 @@
         <w:rPr>
           <w:color w:val="0B3D91"/>
         </w:rPr>
-        <w:t>4. Сервис — «Что получает пользователь»</w:t>
+        <w:t>3. Проверка — «Откуда знаем, что работает» (1:25, слайды 6–7)</w:t>
       </w:r>
     </w:p>
     <w:p>
@@ -732,7 +681,7 @@
         <w:spacing w:after="120"/>
       </w:pPr>
       <w:r>
-        <w:t>Представьте дежурного в центре управления в кризисных ситуациях. Он открывает наш сайт, обводит на карте свой район, выбирает даты — и через секунду видит четыре слоя: вода до, вода в пик, где прибыло, где ушло. Есть шторка: потянул — и сравниваешь два состояния глазами.</w:t>
+        <w:t>Модель хороша на том, на чём училась, поэтому валидацию мы делали по событию: паводок 2021 года на Зее полностью отложили — сеть его не видела. На нём честная цифра: новое затопление 0,53, вода на пике 0,57, вода «до» — 1,0. Все три порога — 0,95, 0,78 и 0,95 — калибровали только на этой паре. ⟨Из абляций: радарный энкодер, обученный с нуля, обошёл предобученный — домен паводков далёк от претрейна.⟩ По всем данным наш собственный расчёт — 0,758, платформа показала 0,768. Совпало.</w:t>
       </w:r>
     </w:p>
     <w:p>
@@ -740,7 +689,7 @@
         <w:spacing w:after="120"/>
       </w:pPr>
       <w:r>
-        <w:t>Рядом отчёт. Например, район Свободный: было 3 985 гектаров воды, стало 6 801. Новой воды — 3 211 гектаров, ушло 640. Зеркало выросло на 71 процент. Тут же видно, что именно затопило: поля, лес, застройку.</w:t>
+        <w:t>А теперь самое интересное: мы проверили сам эталон — скриптом, он лежит в репозитории. Три находки. У пяти пар из одиннадцати в масках воды нет постоянной реки: Константиновка-2021 — 30 гектаров воды «до» при реке в 5 436 гектаров; причина — сцены орбиты 105 покрывали район частично. По Зее площадь затопления в JSON — 2 179 гектаров, а в маске — 2 484, разница 14 процентов. И третье: затопление в эталоне не равно «пик минус до минус постоянная вода» — расхождение до 1 156 гектаров. Вывод: такую разметку арифметикой не получить, её надо учить отдельной головой. ⟨И да — на Поярково ту же ошибку с орбитой 105 мы нашли у себя и переключились на орбиту 32.⟩</w:t>
       </w:r>
     </w:p>
     <w:p>
@@ -748,23 +697,7 @@
         <w:spacing w:after="120"/>
       </w:pPr>
       <w:r>
-        <w:t>Всё это скачивается одним кликом — GeoJSON, GeoTIFF, таблица — и открывается в любой картографической программе. А если у службы своя система, она забирает те же данные через API.</w:t>
-      </w:r>
-    </w:p>
-    <w:p>
-      <w:pPr>
-        <w:spacing w:after="120"/>
-      </w:pPr>
-      <w:r>
-        <w:t>Как это живёт дальше: спутник пролетел — новый снимок обработался за 10–20 секунд — отчёт пересчитался. Разворачивается всё одной командой на обычном сервере. Тяжёлая видеокарта не нужна: модели хватает 2–3 гигабайт, а сам сайт работает вообще без неё. Версии всех библиотек зафиксированы, есть 22 автотеста — коллеги повторят наш результат один в один.</w:t>
-      </w:r>
-    </w:p>
-    <w:p>
-      <w:pPr>
-        <w:spacing w:after="120"/>
-      </w:pPr>
-      <w:r>
-        <w:t>Осталось честно сказать, чего мы пока не умеем. [имя].</w:t>
+        <w:t>Но модель — половина дела. Спасателю нужна не нейросеть, а карта и цифры. [имя].</w:t>
       </w:r>
     </w:p>
     <w:p>
@@ -775,7 +708,7 @@
         <w:rPr>
           <w:color w:val="0B3D91"/>
         </w:rPr>
-        <w:t>5. Итог</w:t>
+        <w:t>4. Сервис — «Что получает пользователь» (1:20, слайды 8–9)</w:t>
       </w:r>
     </w:p>
     <w:p>
@@ -783,7 +716,7 @@
         <w:spacing w:after="120"/>
       </w:pPr>
       <w:r>
-        <w:t>Три вещи, о которых мы знаем. Мы не видим воду под кронами деревьев — радар туда не пробивается. На очень широких поймах, как под Поярково, мы завышаем площадь. И пока не учитываем угол, под которым снимал радар.</w:t>
+        <w:t>Представьте дежурного ЦУКС. Он открывает наш сервис, обводит район или задаёт bbox, выбирает даты — и через секунду получает четыре слоя: вода до, вода на пике, прирост, убыль. Шторка — тянешь и сравниваешь две даты глазами.</w:t>
       </w:r>
     </w:p>
     <w:p>
@@ -791,7 +724,7 @@
         <w:spacing w:after="120"/>
       </w:pPr>
       <w:r>
-        <w:t>С этого и начнётся развитие: брать не два снимка, а всю серию за сезон, добавить события других лет и считать отчёты не по районам, а по бассейнам рек.</w:t>
+        <w:t>Рядом отчёт. Свободный, Зея-2021: было 3 985 гектаров воды, стало 6 801, новое затопление — 3 211 гектаров, ушло 640, зеркало выросло на 71 процент. Тут же — что затопило по типам поверхности: поля, лес, застройка. Всё выгружается: GeoJSON, GeoTIFF, CSV, JSON. И всё то же доступно через REST API — Swagger на /docs, так что ведомственная система забирает данные без человека.</w:t>
       </w:r>
     </w:p>
     <w:p>
@@ -799,7 +732,7 @@
         <w:spacing w:after="120"/>
       </w:pPr>
       <w:r>
-        <w:t>Итого: модель с оценкой 0,768, работающий сервис с картой, отчётом и API — и пайплайн, который повторит любой.</w:t>
+        <w:t>Как это живёт дальше. Пролёт Sentinel-1 — сцена выгружается на сетку района — модель считает маски за 10–20 секунд на GPU — POST /api/observations сравнивает с опорным состоянием «до», и пересчитывается только разница. Разворачивается одной командой: docker compose up. Ресурсы скромные: модели хватает 2–3 гигабайт видеопамяти, сервис работает вообще без GPU. И всё повторяемо: версии зафиксированы в uv.lock, seed, контрольные суммы весов и масок, 22 автотеста.</w:t>
       </w:r>
     </w:p>
     <w:p>
@@ -807,7 +740,42 @@
         <w:spacing w:after="120"/>
       </w:pPr>
       <w:r>
-        <w:t>Спасибо. Мы готовы к вопросам.</w:t>
+        <w:t>Осталось честно сказать, где границы. [имя].</w:t>
+      </w:r>
+    </w:p>
+    <w:p>
+      <w:pPr>
+        <w:pStyle w:val="Heading2"/>
+      </w:pPr>
+      <w:r>
+        <w:rPr>
+          <w:color w:val="0B3D91"/>
+        </w:rPr>
+        <w:t>5. Итог — «Границы и что дальше» (0:40, слайд 10)</w:t>
+      </w:r>
+    </w:p>
+    <w:p>
+      <w:pPr>
+        <w:spacing w:after="120"/>
+      </w:pPr>
+      <w:r>
+        <w:t>Три ограничения, о которых мы знаем. Не учитываем угол падения радара. Не видим воду под кронами — для этого нужен слой double-bounce, он в планах. И на широких поймах, как под Поярково, завышаем площадь. Отсюда развитие: временной ряд Sentinel-1 вместо одной пары, паводки 2013 и 2022 годов в обучение, агрегация отчётов по бассейнам рек.</w:t>
+      </w:r>
+    </w:p>
+    <w:p>
+      <w:pPr>
+        <w:spacing w:after="120"/>
+      </w:pPr>
+      <w:r>
+        <w:t>Итого: модель 0,768 с честной валидацией, сервис с картой, отчётом и API, и пайплайн, который повторит любой одной командой.</w:t>
+      </w:r>
+    </w:p>
+    <w:p>
+      <w:pPr>
+        <w:spacing w:after="120"/>
+      </w:pPr>
+      <w:r>
+        <w:t>Спасибо — готовы к вопросам!</w:t>
       </w:r>
     </w:p>
     <w:p>
@@ -2275,7 +2243,7 @@
         <w:pStyle w:val="ListNumber"/>
       </w:pPr>
       <w:r>
-        <w:t>Прогнать речь вслух два раза с таймером. Цель — 5,5 минут. Лимит уточнить в регламенте.</w:t>
+        <w:t>Прогнать речь вслух два раза с таймером. Цель — 6 минут; если лимит 5 — убрать фразы в ⟨скобках⟩.</w:t>
       </w:r>
     </w:p>
     <w:p>

</xml_diff>

<commit_message>
4-minute speech + 2-minute Q&A; memo/docx updated; memo docx builder
Co-authored-by: arena-agent <297053741+arena-agent@users.noreply.github.com>
</commit_message>
<xml_diff>
--- a/Памятка_защита.docx
+++ b/Памятка_защита.docx
@@ -188,11 +188,13 @@
           <w:p>
             <w:r>
               <w:rPr>
+                <w:b w:val="0"/>
                 <w:sz w:val="21"/>
               </w:rPr>
             </w:r>
             <w:r>
               <w:rPr>
+                <w:b w:val="0"/>
                 <w:sz w:val="21"/>
               </w:rPr>
               <w:t>1. Капитан</w:t>
@@ -206,11 +208,13 @@
           <w:p>
             <w:r>
               <w:rPr>
+                <w:b w:val="0"/>
                 <w:sz w:val="21"/>
               </w:rPr>
             </w:r>
             <w:r>
               <w:rPr>
+                <w:b w:val="0"/>
                 <w:sz w:val="21"/>
               </w:rPr>
               <w:t>Зачем это нужно, что за задача, что за данные</w:t>
@@ -224,11 +228,13 @@
           <w:p>
             <w:r>
               <w:rPr>
+                <w:b w:val="0"/>
                 <w:sz w:val="21"/>
               </w:rPr>
             </w:r>
             <w:r>
               <w:rPr>
+                <w:b w:val="0"/>
                 <w:sz w:val="21"/>
               </w:rPr>
               <w:t>1–3</w:t>
@@ -242,11 +248,95 @@
           <w:p>
             <w:r>
               <w:rPr>
+                <w:b w:val="0"/>
                 <w:sz w:val="21"/>
               </w:rPr>
             </w:r>
             <w:r>
               <w:rPr>
+                <w:b w:val="0"/>
+                <w:sz w:val="21"/>
+              </w:rPr>
+              <w:t>0:40</w:t>
+            </w:r>
+          </w:p>
+        </w:tc>
+      </w:tr>
+      <w:tr>
+        <w:tc>
+          <w:tcPr>
+            <w:tcW w:type="dxa" w:w="2493"/>
+          </w:tcPr>
+          <w:p>
+            <w:r>
+              <w:rPr>
+                <w:b w:val="0"/>
+                <w:sz w:val="21"/>
+              </w:rPr>
+            </w:r>
+            <w:r>
+              <w:rPr>
+                <w:b w:val="0"/>
+                <w:sz w:val="21"/>
+              </w:rPr>
+              <w:t>2. Модель</w:t>
+            </w:r>
+          </w:p>
+        </w:tc>
+        <w:tc>
+          <w:tcPr>
+            <w:tcW w:type="dxa" w:w="2493"/>
+          </w:tcPr>
+          <w:p>
+            <w:r>
+              <w:rPr>
+                <w:b w:val="0"/>
+                <w:sz w:val="21"/>
+              </w:rPr>
+            </w:r>
+            <w:r>
+              <w:rPr>
+                <w:b w:val="0"/>
+                <w:sz w:val="21"/>
+              </w:rPr>
+              <w:t>Почему простой способ не работает и как сделали мы</w:t>
+            </w:r>
+          </w:p>
+        </w:tc>
+        <w:tc>
+          <w:tcPr>
+            <w:tcW w:type="dxa" w:w="2493"/>
+          </w:tcPr>
+          <w:p>
+            <w:r>
+              <w:rPr>
+                <w:b w:val="0"/>
+                <w:sz w:val="21"/>
+              </w:rPr>
+            </w:r>
+            <w:r>
+              <w:rPr>
+                <w:b w:val="0"/>
+                <w:sz w:val="21"/>
+              </w:rPr>
+              <w:t>4–5</w:t>
+            </w:r>
+          </w:p>
+        </w:tc>
+        <w:tc>
+          <w:tcPr>
+            <w:tcW w:type="dxa" w:w="2493"/>
+          </w:tcPr>
+          <w:p>
+            <w:r>
+              <w:rPr>
+                <w:b w:val="0"/>
+                <w:sz w:val="21"/>
+              </w:rPr>
+            </w:r>
+            <w:r>
+              <w:rPr>
+                <w:b w:val="0"/>
                 <w:sz w:val="21"/>
               </w:rPr>
               <w:t>1:05</w:t>
@@ -262,85 +352,13 @@
           <w:p>
             <w:r>
               <w:rPr>
+                <w:b w:val="0"/>
                 <w:sz w:val="21"/>
               </w:rPr>
             </w:r>
             <w:r>
               <w:rPr>
-                <w:sz w:val="21"/>
-              </w:rPr>
-              <w:t>2. Модель</w:t>
-            </w:r>
-          </w:p>
-        </w:tc>
-        <w:tc>
-          <w:tcPr>
-            <w:tcW w:type="dxa" w:w="2493"/>
-          </w:tcPr>
-          <w:p>
-            <w:r>
-              <w:rPr>
-                <w:sz w:val="21"/>
-              </w:rPr>
-            </w:r>
-            <w:r>
-              <w:rPr>
-                <w:sz w:val="21"/>
-              </w:rPr>
-              <w:t>Почему простой способ не работает и как сделали мы</w:t>
-            </w:r>
-          </w:p>
-        </w:tc>
-        <w:tc>
-          <w:tcPr>
-            <w:tcW w:type="dxa" w:w="2493"/>
-          </w:tcPr>
-          <w:p>
-            <w:r>
-              <w:rPr>
-                <w:sz w:val="21"/>
-              </w:rPr>
-            </w:r>
-            <w:r>
-              <w:rPr>
-                <w:sz w:val="21"/>
-              </w:rPr>
-              <w:t>4–5</w:t>
-            </w:r>
-          </w:p>
-        </w:tc>
-        <w:tc>
-          <w:tcPr>
-            <w:tcW w:type="dxa" w:w="2493"/>
-          </w:tcPr>
-          <w:p>
-            <w:r>
-              <w:rPr>
-                <w:sz w:val="21"/>
-              </w:rPr>
-            </w:r>
-            <w:r>
-              <w:rPr>
-                <w:sz w:val="21"/>
-              </w:rPr>
-              <w:t>1:30</w:t>
-            </w:r>
-          </w:p>
-        </w:tc>
-      </w:tr>
-      <w:tr>
-        <w:tc>
-          <w:tcPr>
-            <w:tcW w:type="dxa" w:w="2493"/>
-          </w:tcPr>
-          <w:p>
-            <w:r>
-              <w:rPr>
-                <w:sz w:val="21"/>
-              </w:rPr>
-            </w:r>
-            <w:r>
-              <w:rPr>
+                <w:b w:val="0"/>
                 <w:sz w:val="21"/>
               </w:rPr>
               <w:t>3. Проверка</w:t>
@@ -354,11 +372,13 @@
           <w:p>
             <w:r>
               <w:rPr>
+                <w:b w:val="0"/>
                 <w:sz w:val="21"/>
               </w:rPr>
             </w:r>
             <w:r>
               <w:rPr>
+                <w:b w:val="0"/>
                 <w:sz w:val="21"/>
               </w:rPr>
               <w:t>Откуда знаем, что работает; ошибки в разметке</w:t>
@@ -372,11 +392,13 @@
           <w:p>
             <w:r>
               <w:rPr>
+                <w:b w:val="0"/>
                 <w:sz w:val="21"/>
               </w:rPr>
             </w:r>
             <w:r>
               <w:rPr>
+                <w:b w:val="0"/>
                 <w:sz w:val="21"/>
               </w:rPr>
               <w:t>6–7</w:t>
@@ -390,14 +412,16 @@
           <w:p>
             <w:r>
               <w:rPr>
+                <w:b w:val="0"/>
                 <w:sz w:val="21"/>
               </w:rPr>
             </w:r>
             <w:r>
               <w:rPr>
+                <w:b w:val="0"/>
                 <w:sz w:val="21"/>
               </w:rPr>
-              <w:t>1:25</w:t>
+              <w:t>0:55</w:t>
             </w:r>
           </w:p>
         </w:tc>
@@ -410,11 +434,13 @@
           <w:p>
             <w:r>
               <w:rPr>
+                <w:b w:val="0"/>
                 <w:sz w:val="21"/>
               </w:rPr>
             </w:r>
             <w:r>
               <w:rPr>
+                <w:b w:val="0"/>
                 <w:sz w:val="21"/>
               </w:rPr>
               <w:t>4. Сервис</w:t>
@@ -428,11 +454,13 @@
           <w:p>
             <w:r>
               <w:rPr>
+                <w:b w:val="0"/>
                 <w:sz w:val="21"/>
               </w:rPr>
             </w:r>
             <w:r>
               <w:rPr>
+                <w:b w:val="0"/>
                 <w:sz w:val="21"/>
               </w:rPr>
               <w:t>Что видит пользователь; как обновляется; что нужно для запуска</w:t>
@@ -446,11 +474,13 @@
           <w:p>
             <w:r>
               <w:rPr>
+                <w:b w:val="0"/>
                 <w:sz w:val="21"/>
               </w:rPr>
             </w:r>
             <w:r>
               <w:rPr>
+                <w:b w:val="0"/>
                 <w:sz w:val="21"/>
               </w:rPr>
               <w:t>8–9</w:t>
@@ -464,14 +494,16 @@
           <w:p>
             <w:r>
               <w:rPr>
+                <w:b w:val="0"/>
                 <w:sz w:val="21"/>
               </w:rPr>
             </w:r>
             <w:r>
               <w:rPr>
+                <w:b w:val="0"/>
                 <w:sz w:val="21"/>
               </w:rPr>
-              <w:t>1:20</w:t>
+              <w:t>0:50</w:t>
             </w:r>
           </w:p>
         </w:tc>
@@ -484,11 +516,13 @@
           <w:p>
             <w:r>
               <w:rPr>
+                <w:b w:val="0"/>
                 <w:sz w:val="21"/>
               </w:rPr>
             </w:r>
             <w:r>
               <w:rPr>
+                <w:b w:val="0"/>
                 <w:sz w:val="21"/>
               </w:rPr>
               <w:t>5. Итог</w:t>
@@ -502,11 +536,13 @@
           <w:p>
             <w:r>
               <w:rPr>
+                <w:b w:val="0"/>
                 <w:sz w:val="21"/>
               </w:rPr>
             </w:r>
             <w:r>
               <w:rPr>
+                <w:b w:val="0"/>
                 <w:sz w:val="21"/>
               </w:rPr>
               <w:t>Чего не умеем, что дальше, финал; ведёт вопросы</w:t>
@@ -520,11 +556,13 @@
           <w:p>
             <w:r>
               <w:rPr>
+                <w:b w:val="0"/>
                 <w:sz w:val="21"/>
               </w:rPr>
             </w:r>
             <w:r>
               <w:rPr>
+                <w:b w:val="0"/>
                 <w:sz w:val="21"/>
               </w:rPr>
               <w:t>10</w:t>
@@ -538,14 +576,16 @@
           <w:p>
             <w:r>
               <w:rPr>
+                <w:b w:val="0"/>
                 <w:sz w:val="21"/>
               </w:rPr>
             </w:r>
             <w:r>
               <w:rPr>
+                <w:b w:val="0"/>
                 <w:sz w:val="21"/>
               </w:rPr>
-              <w:t>0:40</w:t>
+              <w:t>0:30</w:t>
             </w:r>
           </w:p>
         </w:tc>
@@ -557,7 +597,7 @@
         <w:spacing w:after="120"/>
       </w:pPr>
       <w:r>
-        <w:t>Итого около 6 минут. Слайды листает один человек (спикер 4), остальные к ноутбуку не подходят.</w:t>
+        <w:t>Итого 4 минуты, затем 2 минуты вопросов. Слайды листает один человек (спикер 4), остальные к ноутбуку не подходят.</w:t>
       </w:r>
     </w:p>
     <w:p>
@@ -568,7 +608,7 @@
         <w:rPr>
           <w:color w:val="0A7AFF"/>
         </w:rPr>
-        <w:t>3. Речь</w:t>
+        <w:t>3. Речь — 4 минуты (+ 2 минуты вопросов)</w:t>
       </w:r>
     </w:p>
     <w:p>
@@ -576,7 +616,7 @@
         <w:spacing w:after="120"/>
       </w:pPr>
       <w:r>
-        <w:t>Живой рассказ с сутью для экспертов, около 6 минут. Если лимит 5 минут — убрать фразы, помеченные ⟨так⟩.</w:t>
+        <w:t>Пять человек, каждый 30–65 секунд. Фразы в ⟨скобках⟩ — резерв: убрать, если на прогоне не укладываетесь в 4:00.</w:t>
       </w:r>
     </w:p>
     <w:p>
@@ -587,7 +627,7 @@
         <w:rPr>
           <w:color w:val="0B3D91"/>
         </w:rPr>
-        <w:t>1. Капитан — «Зачем и с чем работаем» (1:05, слайды 1–3)</w:t>
+        <w:t>1. Капитан — задача и данные (0:40, слайды 1–3)</w:t>
       </w:r>
     </w:p>
     <w:p>
@@ -595,7 +635,7 @@
         <w:spacing w:after="120"/>
       </w:pPr>
       <w:r>
-        <w:t>Добрый день! Мы — команда «Победное очко», и мы сделали HydroWatch Amur.</w:t>
+        <w:t>Добрый день! Мы — команда «Победное очко».</w:t>
       </w:r>
     </w:p>
     <w:p>
@@ -603,7 +643,7 @@
         <w:spacing w:after="120"/>
       </w:pPr>
       <w:r>
-        <w:t>2013 год, Амур: под водой сёла, дороги, поля. У спасателей в такие дни один вопрос — где сейчас вода и сколько её, и ответ нужен за часы. Спутники снимают Амур каждые несколько дней, но снимок — это ещё не ответ. Наша программа берёт пару снимков — «до» паводка и на его «пике» — и выдаёт три карты: вода до, вода на пике и новое затопление, плюс площади в гектарах. По оценке организаторов — 0,768.</w:t>
+        <w:t>Когда Амур выходит из берегов, спасателям нужно за часы понять, где вода и сколько её. Наша программа берёт два спутниковых снимка — до паводка и на пике — и выдаёт три карты: вода до, вода на пике и новое затопление, с площадями в гектарах. Оценка на платформе — 0,768.</w:t>
       </w:r>
     </w:p>
     <w:p>
@@ -611,7 +651,7 @@
         <w:spacing w:after="120"/>
       </w:pPr>
       <w:r>
-        <w:t>Три факта про данные, которые определили всё решение. Первый: новое затопление занимает от 0,02 до 2 процентов сцены — иголка в стоге сена. Второй: у пяти пар из одиннадцати оптики нет вообще, только радар. И третий: между «до» и «пиком» шесть недель, ⟨а радар и оптика разнесены ещё до пяти суток,⟩ — простое вычитание карт ловит не паводок, а сезон.</w:t>
+        <w:t>Данные сложные: новая вода — меньше двух процентов снимка, у пяти пар из одиннадцати нет оптики, только радар, а между снимками шесть недель.</w:t>
       </w:r>
     </w:p>
     <w:p>
@@ -619,7 +659,7 @@
         <w:spacing w:after="120"/>
       </w:pPr>
       <w:r>
-        <w:t>Как мы с этим справились — [имя].</w:t>
+        <w:t>Как мы это решили — [имя].</w:t>
       </w:r>
     </w:p>
     <w:p>
@@ -630,7 +670,7 @@
         <w:rPr>
           <w:color w:val="0B3D91"/>
         </w:rPr>
-        <w:t>2. Модель — «Как устроено» (1:30, слайды 4–5)</w:t>
+        <w:t>2. Модель — как устроена (1:05, слайды 4–5)</w:t>
       </w:r>
     </w:p>
     <w:p>
@@ -638,7 +678,7 @@
         <w:spacing w:after="120"/>
       </w:pPr>
       <w:r>
-        <w:t>Начали мы, как все, с классики: порог Оцу по радару и разность масок. Не сработало, и понятно почему. У радара ветровая рябь на воде выглядит как суша, а радиотени от гор — как вода. У оптики свои беды — мутная вода и тени. Важно, что эти ошибки не совпадают. Значит, объединять модальности нужно не на уровне готовых масок, а на уровне признаков, внутри одной сети.</w:t>
+        <w:t>Простой путь — порог яркости по радару и вычесть одну карту из другой — мы проверили первым. Не работает: ветер на воде радар видит как сушу, тени гор — как воду, у оптики мешают мутная вода и облака. Ошибки у них разные — поэтому мы объединяем радар и оптику внутри одной нейросети.</w:t>
       </w:r>
     </w:p>
     <w:p>
@@ -646,7 +686,7 @@
         <w:spacing w:after="120"/>
       </w:pPr>
       <w:r>
-        <w:t>Так появилась наша архитектура — сиамская мультимодальная U-Net. Две ветки-энкодера ResNet-18: одна читает радар, вторая — оптику. Каждая смотрит и на «до», и на «пик», и на каждом уровне мы формируем временные признаки: было, стало, разность. Добавляем рельеф — высоту над ближайшей рекой, уклон, карту постоянной воды — и флаг: есть ли оптика вообще. Декодер выдаёт три карты.</w:t>
+        <w:t>Это U-Net с двумя энкодерами ResNet-18: один читает радар, другой — оптику, каждый видит и «до», и «пик». Сеть сама сравнивает даты, а ещё получает рельеф — высоту над рекой — и карту постоянной воды.</w:t>
       </w:r>
     </w:p>
     <w:p>
@@ -654,15 +694,7 @@
         <w:spacing w:after="120"/>
       </w:pPr>
       <w:r>
-        <w:t>Три решения, которые дали результат. Первое — modality dropout: при обучении в половине батчей мы выключали оптику, поэтому пары без неё для сети — норма, а не авария. Второе — функция потерь под дисбаланс: focal Tversky плюс штраф за площадь плюс гидрологические правила — затопление может быть только внутри воды пика и вне воды «до». Третье — новое затопление предсказывает отдельная голова, а не разность масок.</w:t>
-      </w:r>
-    </w:p>
-    <w:p>
-      <w:pPr>
-        <w:spacing w:after="120"/>
-      </w:pPr>
-      <w:r>
-        <w:t>Почему это принципиально — сейчас покажет [имя]: оказалось, что даже эталон разности не равен.</w:t>
+        <w:t>Три приёма дали результат. Первый: при обучении в половине случаев мы прятали оптику — без неё сеть работает штатно. Второй: в функцию потерь зашили правила — новая вода только внутри воды пика и вне воды «до». Третий: новое затопление предсказывает отдельная голова, а не разность карт. Почему это важно — [имя].</w:t>
       </w:r>
     </w:p>
     <w:p>
@@ -673,7 +705,7 @@
         <w:rPr>
           <w:color w:val="0B3D91"/>
         </w:rPr>
-        <w:t>3. Проверка — «Откуда знаем, что работает» (1:25, слайды 6–7)</w:t>
+        <w:t>3. Проверка — откуда знаем, что работает (0:55, слайды 6–7)</w:t>
       </w:r>
     </w:p>
     <w:p>
@@ -681,7 +713,7 @@
         <w:spacing w:after="120"/>
       </w:pPr>
       <w:r>
-        <w:t>Модель хороша на том, на чём училась, поэтому валидацию мы делали по событию: паводок 2021 года на Зее полностью отложили — сеть его не видела. На нём честная цифра: новое затопление 0,53, вода на пике 0,57, вода «до» — 1,0. Все три порога — 0,95, 0,78 и 0,95 — калибровали только на этой паре. ⟨Из абляций: радарный энкодер, обученный с нуля, обошёл предобученный — домен паводков далёк от претрейна.⟩ По всем данным наш собственный расчёт — 0,758, платформа показала 0,768. Совпало.</w:t>
+        <w:t>Проверяли честно: паводок 2021 года на Зее в обучение не давали. На нём новое затопление 0,53, вода на пике 0,57, вода до — 1,0. Пороги подбирали только на нём. По всем данным у нас 0,758, платформа дала 0,768.</w:t>
       </w:r>
     </w:p>
     <w:p>
@@ -689,7 +721,7 @@
         <w:spacing w:after="120"/>
       </w:pPr>
       <w:r>
-        <w:t>А теперь самое интересное: мы проверили сам эталон — скриптом, он лежит в репозитории. Три находки. У пяти пар из одиннадцати в масках воды нет постоянной реки: Константиновка-2021 — 30 гектаров воды «до» при реке в 5 436 гектаров; причина — сцены орбиты 105 покрывали район частично. По Зее площадь затопления в JSON — 2 179 гектаров, а в маске — 2 484, разница 14 процентов. И третье: затопление в эталоне не равно «пик минус до минус постоянная вода» — расхождение до 1 156 гектаров. Вывод: такую разметку арифметикой не получить, её надо учить отдельной головой. ⟨И да — на Поярково ту же ошибку с орбитой 105 мы нашли у себя и переключились на орбиту 32.⟩</w:t>
+        <w:t>Затем мы проверили сам эталон и нашли ошибки. У пяти пар из одиннадцати в масках нет реки: в Константиновке 30 гектаров воды при реке в 5 436. По Зее таблица и маска расходятся на 14 процентов. И затопление в эталоне не равно «пик минус до». Поэтому новую воду мы учим отдельно, а не считаем арифметикой.</w:t>
       </w:r>
     </w:p>
     <w:p>
@@ -697,7 +729,7 @@
         <w:spacing w:after="120"/>
       </w:pPr>
       <w:r>
-        <w:t>Но модель — половина дела. Спасателю нужна не нейросеть, а карта и цифры. [имя].</w:t>
+        <w:t>Что получает пользователь — [имя].</w:t>
       </w:r>
     </w:p>
     <w:p>
@@ -708,7 +740,7 @@
         <w:rPr>
           <w:color w:val="0B3D91"/>
         </w:rPr>
-        <w:t>4. Сервис — «Что получает пользователь» (1:20, слайды 8–9)</w:t>
+        <w:t>4. Сервис — что получает пользователь (0:50, слайды 8–9)</w:t>
       </w:r>
     </w:p>
     <w:p>
@@ -716,7 +748,7 @@
         <w:spacing w:after="120"/>
       </w:pPr>
       <w:r>
-        <w:t>Представьте дежурного ЦУКС. Он открывает наш сервис, обводит район или задаёт bbox, выбирает даты — и через секунду получает четыре слоя: вода до, вода на пике, прирост, убыль. Шторка — тянешь и сравниваешь две даты глазами.</w:t>
+        <w:t>Дежурный ЦУКС обводит район, выбирает даты — и через секунду видит четыре слоя: вода до, на пике, прирост, убыль, со шторкой для сравнения. Рядом отчёт: Свободный — новой воды 3 211 гектаров, ушло 640, зеркало выросло на 71 процент, ⟨разбивка по типам поверхности⟩. Выгрузка в GeoJSON, GeoTIFF, CSV — и всё то же через REST API.</w:t>
       </w:r>
     </w:p>
     <w:p>
@@ -724,7 +756,7 @@
         <w:spacing w:after="120"/>
       </w:pPr>
       <w:r>
-        <w:t>Рядом отчёт. Свободный, Зея-2021: было 3 985 гектаров воды, стало 6 801, новое затопление — 3 211 гектаров, ушло 640, зеркало выросло на 71 процент. Тут же — что затопило по типам поверхности: поля, лес, застройка. Всё выгружается: GeoJSON, GeoTIFF, CSV, JSON. И всё то же доступно через REST API — Swagger на /docs, так что ведомственная система забирает данные без человека.</w:t>
+        <w:t>Новый пролёт спутника — маски за 10–20 секунд, пересчитывается только разница. Запуск одной командой docker compose up, модели хватает 2–3 гигабайт видеопамяти, ⟨версии и контрольные суммы зафиксированы, 22 теста⟩.</w:t>
       </w:r>
     </w:p>
     <w:p>
@@ -732,15 +764,7 @@
         <w:spacing w:after="120"/>
       </w:pPr>
       <w:r>
-        <w:t>Как это живёт дальше. Пролёт Sentinel-1 — сцена выгружается на сетку района — модель считает маски за 10–20 секунд на GPU — POST /api/observations сравнивает с опорным состоянием «до», и пересчитывается только разница. Разворачивается одной командой: docker compose up. Ресурсы скромные: модели хватает 2–3 гигабайт видеопамяти, сервис работает вообще без GPU. И всё повторяемо: версии зафиксированы в uv.lock, seed, контрольные суммы весов и масок, 22 автотеста.</w:t>
-      </w:r>
-    </w:p>
-    <w:p>
-      <w:pPr>
-        <w:spacing w:after="120"/>
-      </w:pPr>
-      <w:r>
-        <w:t>Осталось честно сказать, где границы. [имя].</w:t>
+        <w:t>Где границы — [имя].</w:t>
       </w:r>
     </w:p>
     <w:p>
@@ -751,7 +775,7 @@
         <w:rPr>
           <w:color w:val="0B3D91"/>
         </w:rPr>
-        <w:t>5. Итог — «Границы и что дальше» (0:40, слайд 10)</w:t>
+        <w:t>5. Итог (0:30, слайд 10)</w:t>
       </w:r>
     </w:p>
     <w:p>
@@ -759,7 +783,7 @@
         <w:spacing w:after="120"/>
       </w:pPr>
       <w:r>
-        <w:t>Три ограничения, о которых мы знаем. Не учитываем угол падения радара. Не видим воду под кронами — для этого нужен слой double-bounce, он в планах. И на широких поймах, как под Поярково, завышаем площадь. Отсюда развитие: временной ряд Sentinel-1 вместо одной пары, паводки 2013 и 2022 годов в обучение, агрегация отчётов по бассейнам рек.</w:t>
+        <w:t>Не видим воду под деревьями, на широких поймах завышаем, угол съёмки радара не учитываем. Дальше — серия снимков вместо пары, больше паводков в обучение, отчёты по бассейнам рек.</w:t>
       </w:r>
     </w:p>
     <w:p>
@@ -767,15 +791,7 @@
         <w:spacing w:after="120"/>
       </w:pPr>
       <w:r>
-        <w:t>Итого: модель 0,768 с честной валидацией, сервис с картой, отчётом и API, и пайплайн, который повторит любой одной командой.</w:t>
-      </w:r>
-    </w:p>
-    <w:p>
-      <w:pPr>
-        <w:spacing w:after="120"/>
-      </w:pPr>
-      <w:r>
-        <w:t>Спасибо — готовы к вопросам!</w:t>
+        <w:t>Итого: модель 0,768, рабочий сервис с API, воспроизводимый пайплайн. Спасибо — готовы к вопросам!</w:t>
       </w:r>
     </w:p>
     <w:p>
@@ -870,11 +886,13 @@
           <w:p>
             <w:r>
               <w:rPr>
+                <w:b w:val="0"/>
                 <w:sz w:val="21"/>
               </w:rPr>
             </w:r>
             <w:r>
               <w:rPr>
+                <w:b w:val="0"/>
                 <w:sz w:val="21"/>
               </w:rPr>
               <w:t>Оценка на сайте</w:t>
@@ -888,6 +906,7 @@
           <w:p>
             <w:r>
               <w:rPr>
+                <w:b w:val="0"/>
                 <w:sz w:val="21"/>
               </w:rPr>
             </w:r>
@@ -907,11 +926,13 @@
           <w:p>
             <w:r>
               <w:rPr>
+                <w:b w:val="0"/>
                 <w:sz w:val="21"/>
               </w:rPr>
             </w:r>
             <w:r>
               <w:rPr>
+                <w:b w:val="0"/>
                 <w:sz w:val="21"/>
               </w:rPr>
               <w:t>все</w:t>
@@ -927,11 +948,13 @@
           <w:p>
             <w:r>
               <w:rPr>
+                <w:b w:val="0"/>
                 <w:sz w:val="21"/>
               </w:rPr>
             </w:r>
             <w:r>
               <w:rPr>
+                <w:b w:val="0"/>
                 <w:sz w:val="21"/>
               </w:rPr>
               <w:t>Наша своя оценка по всем данным</w:t>
@@ -945,11 +968,13 @@
           <w:p>
             <w:r>
               <w:rPr>
+                <w:b w:val="0"/>
                 <w:sz w:val="21"/>
               </w:rPr>
             </w:r>
             <w:r>
               <w:rPr>
+                <w:b w:val="0"/>
                 <w:sz w:val="21"/>
               </w:rPr>
               <w:t>0,758</w:t>
@@ -963,11 +988,13 @@
           <w:p>
             <w:r>
               <w:rPr>
+                <w:b w:val="0"/>
                 <w:sz w:val="21"/>
               </w:rPr>
             </w:r>
             <w:r>
               <w:rPr>
+                <w:b w:val="0"/>
                 <w:sz w:val="21"/>
               </w:rPr>
               <w:t>3</w:t>
@@ -983,11 +1010,13 @@
           <w:p>
             <w:r>
               <w:rPr>
+                <w:b w:val="0"/>
                 <w:sz w:val="21"/>
               </w:rPr>
             </w:r>
             <w:r>
               <w:rPr>
+                <w:b w:val="0"/>
                 <w:sz w:val="21"/>
               </w:rPr>
               <w:t>Пар снимков / районов</w:t>
@@ -1001,11 +1030,13 @@
           <w:p>
             <w:r>
               <w:rPr>
+                <w:b w:val="0"/>
                 <w:sz w:val="21"/>
               </w:rPr>
             </w:r>
             <w:r>
               <w:rPr>
+                <w:b w:val="0"/>
                 <w:sz w:val="21"/>
               </w:rPr>
               <w:t>11 / 5</w:t>
@@ -1019,11 +1050,13 @@
           <w:p>
             <w:r>
               <w:rPr>
+                <w:b w:val="0"/>
                 <w:sz w:val="21"/>
               </w:rPr>
             </w:r>
             <w:r>
               <w:rPr>
+                <w:b w:val="0"/>
                 <w:sz w:val="21"/>
               </w:rPr>
               <w:t>1</w:t>
@@ -1039,11 +1072,13 @@
           <w:p>
             <w:r>
               <w:rPr>
+                <w:b w:val="0"/>
                 <w:sz w:val="21"/>
               </w:rPr>
             </w:r>
             <w:r>
               <w:rPr>
+                <w:b w:val="0"/>
                 <w:sz w:val="21"/>
               </w:rPr>
               <w:t>Пар без оптики</w:t>
@@ -1057,11 +1092,13 @@
           <w:p>
             <w:r>
               <w:rPr>
+                <w:b w:val="0"/>
                 <w:sz w:val="21"/>
               </w:rPr>
             </w:r>
             <w:r>
               <w:rPr>
+                <w:b w:val="0"/>
                 <w:sz w:val="21"/>
               </w:rPr>
               <w:t>5 из 11</w:t>
@@ -1075,11 +1112,13 @@
           <w:p>
             <w:r>
               <w:rPr>
+                <w:b w:val="0"/>
                 <w:sz w:val="21"/>
               </w:rPr>
             </w:r>
             <w:r>
               <w:rPr>
+                <w:b w:val="0"/>
                 <w:sz w:val="21"/>
               </w:rPr>
               <w:t>1, 2</w:t>
@@ -1095,11 +1134,13 @@
           <w:p>
             <w:r>
               <w:rPr>
+                <w:b w:val="0"/>
                 <w:sz w:val="21"/>
               </w:rPr>
             </w:r>
             <w:r>
               <w:rPr>
+                <w:b w:val="0"/>
                 <w:sz w:val="21"/>
               </w:rPr>
               <w:t>Доля новой воды на снимке</w:t>
@@ -1113,11 +1154,13 @@
           <w:p>
             <w:r>
               <w:rPr>
+                <w:b w:val="0"/>
                 <w:sz w:val="21"/>
               </w:rPr>
             </w:r>
             <w:r>
               <w:rPr>
+                <w:b w:val="0"/>
                 <w:sz w:val="21"/>
               </w:rPr>
               <w:t>0,02–2 %</w:t>
@@ -1131,11 +1174,13 @@
           <w:p>
             <w:r>
               <w:rPr>
+                <w:b w:val="0"/>
                 <w:sz w:val="21"/>
               </w:rPr>
             </w:r>
             <w:r>
               <w:rPr>
+                <w:b w:val="0"/>
                 <w:sz w:val="21"/>
               </w:rPr>
               <w:t>1</w:t>
@@ -1151,11 +1196,13 @@
           <w:p>
             <w:r>
               <w:rPr>
+                <w:b w:val="0"/>
                 <w:sz w:val="21"/>
               </w:rPr>
             </w:r>
             <w:r>
               <w:rPr>
+                <w:b w:val="0"/>
                 <w:sz w:val="21"/>
               </w:rPr>
               <w:t>Время между «до» и «пиком»</w:t>
@@ -1169,11 +1216,13 @@
           <w:p>
             <w:r>
               <w:rPr>
+                <w:b w:val="0"/>
                 <w:sz w:val="21"/>
               </w:rPr>
             </w:r>
             <w:r>
               <w:rPr>
+                <w:b w:val="0"/>
                 <w:sz w:val="21"/>
               </w:rPr>
               <w:t>≈ 6 недель</w:t>
@@ -1187,11 +1236,13 @@
           <w:p>
             <w:r>
               <w:rPr>
+                <w:b w:val="0"/>
                 <w:sz w:val="21"/>
               </w:rPr>
             </w:r>
             <w:r>
               <w:rPr>
+                <w:b w:val="0"/>
                 <w:sz w:val="21"/>
               </w:rPr>
               <w:t>1, 2</w:t>
@@ -1207,11 +1258,13 @@
           <w:p>
             <w:r>
               <w:rPr>
+                <w:b w:val="0"/>
                 <w:sz w:val="21"/>
               </w:rPr>
             </w:r>
             <w:r>
               <w:rPr>
+                <w:b w:val="0"/>
                 <w:sz w:val="21"/>
               </w:rPr>
               <w:t>Отложенное событие</w:t>
@@ -1225,11 +1278,13 @@
           <w:p>
             <w:r>
               <w:rPr>
+                <w:b w:val="0"/>
                 <w:sz w:val="21"/>
               </w:rPr>
             </w:r>
             <w:r>
               <w:rPr>
+                <w:b w:val="0"/>
                 <w:sz w:val="21"/>
               </w:rPr>
               <w:t>Зея-2021</w:t>
@@ -1243,11 +1298,13 @@
           <w:p>
             <w:r>
               <w:rPr>
+                <w:b w:val="0"/>
                 <w:sz w:val="21"/>
               </w:rPr>
             </w:r>
             <w:r>
               <w:rPr>
+                <w:b w:val="0"/>
                 <w:sz w:val="21"/>
               </w:rPr>
               <w:t>3</w:t>
@@ -1263,11 +1320,13 @@
           <w:p>
             <w:r>
               <w:rPr>
+                <w:b w:val="0"/>
                 <w:sz w:val="21"/>
               </w:rPr>
             </w:r>
             <w:r>
               <w:rPr>
+                <w:b w:val="0"/>
                 <w:sz w:val="21"/>
               </w:rPr>
               <w:t>На нём: новая вода / вода в пик / вода до</w:t>
@@ -1281,11 +1340,13 @@
           <w:p>
             <w:r>
               <w:rPr>
+                <w:b w:val="0"/>
                 <w:sz w:val="21"/>
               </w:rPr>
             </w:r>
             <w:r>
               <w:rPr>
+                <w:b w:val="0"/>
                 <w:sz w:val="21"/>
               </w:rPr>
               <w:t>0,53 / 0,57 / 1,0</w:t>
@@ -1299,11 +1360,13 @@
           <w:p>
             <w:r>
               <w:rPr>
+                <w:b w:val="0"/>
                 <w:sz w:val="21"/>
               </w:rPr>
             </w:r>
             <w:r>
               <w:rPr>
+                <w:b w:val="0"/>
                 <w:sz w:val="21"/>
               </w:rPr>
               <w:t>3</w:t>
@@ -1319,11 +1382,13 @@
           <w:p>
             <w:r>
               <w:rPr>
+                <w:b w:val="0"/>
                 <w:sz w:val="21"/>
               </w:rPr>
             </w:r>
             <w:r>
               <w:rPr>
+                <w:b w:val="0"/>
                 <w:sz w:val="21"/>
               </w:rPr>
               <w:t>Веса в оценке: новая вода / пик / до / межень</w:t>
@@ -1337,11 +1402,13 @@
           <w:p>
             <w:r>
               <w:rPr>
+                <w:b w:val="0"/>
                 <w:sz w:val="21"/>
               </w:rPr>
             </w:r>
             <w:r>
               <w:rPr>
+                <w:b w:val="0"/>
                 <w:sz w:val="21"/>
               </w:rPr>
               <w:t>45 / 25 / 15 / 15 %</w:t>
@@ -1355,11 +1422,13 @@
           <w:p>
             <w:r>
               <w:rPr>
+                <w:b w:val="0"/>
                 <w:sz w:val="21"/>
               </w:rPr>
             </w:r>
             <w:r>
               <w:rPr>
+                <w:b w:val="0"/>
                 <w:sz w:val="21"/>
               </w:rPr>
               <w:t>1</w:t>
@@ -1375,11 +1444,13 @@
           <w:p>
             <w:r>
               <w:rPr>
+                <w:b w:val="0"/>
                 <w:sz w:val="21"/>
               </w:rPr>
             </w:r>
             <w:r>
               <w:rPr>
+                <w:b w:val="0"/>
                 <w:sz w:val="21"/>
               </w:rPr>
               <w:t>Пар с ошибкой «нет реки» в разметке</w:t>
@@ -1393,11 +1464,13 @@
           <w:p>
             <w:r>
               <w:rPr>
+                <w:b w:val="0"/>
                 <w:sz w:val="21"/>
               </w:rPr>
             </w:r>
             <w:r>
               <w:rPr>
+                <w:b w:val="0"/>
                 <w:sz w:val="21"/>
               </w:rPr>
               <w:t>5 из 11</w:t>
@@ -1411,11 +1484,13 @@
           <w:p>
             <w:r>
               <w:rPr>
+                <w:b w:val="0"/>
                 <w:sz w:val="21"/>
               </w:rPr>
             </w:r>
             <w:r>
               <w:rPr>
+                <w:b w:val="0"/>
                 <w:sz w:val="21"/>
               </w:rPr>
               <w:t>3</w:t>
@@ -1431,11 +1506,13 @@
           <w:p>
             <w:r>
               <w:rPr>
+                <w:b w:val="0"/>
                 <w:sz w:val="21"/>
               </w:rPr>
             </w:r>
             <w:r>
               <w:rPr>
+                <w:b w:val="0"/>
                 <w:sz w:val="21"/>
               </w:rPr>
               <w:t>Константиновка: воды в разметке / на самом деле река</w:t>
@@ -1449,11 +1526,13 @@
           <w:p>
             <w:r>
               <w:rPr>
+                <w:b w:val="0"/>
                 <w:sz w:val="21"/>
               </w:rPr>
             </w:r>
             <w:r>
               <w:rPr>
+                <w:b w:val="0"/>
                 <w:sz w:val="21"/>
               </w:rPr>
               <w:t>30 га / 5 436 га</w:t>
@@ -1467,11 +1546,13 @@
           <w:p>
             <w:r>
               <w:rPr>
+                <w:b w:val="0"/>
                 <w:sz w:val="21"/>
               </w:rPr>
             </w:r>
             <w:r>
               <w:rPr>
+                <w:b w:val="0"/>
                 <w:sz w:val="21"/>
               </w:rPr>
               <w:t>3</w:t>
@@ -1487,11 +1568,13 @@
           <w:p>
             <w:r>
               <w:rPr>
+                <w:b w:val="0"/>
                 <w:sz w:val="21"/>
               </w:rPr>
             </w:r>
             <w:r>
               <w:rPr>
+                <w:b w:val="0"/>
                 <w:sz w:val="21"/>
               </w:rPr>
               <w:t>Зея: таблица / карта организаторов</w:t>
@@ -1505,11 +1588,13 @@
           <w:p>
             <w:r>
               <w:rPr>
+                <w:b w:val="0"/>
                 <w:sz w:val="21"/>
               </w:rPr>
             </w:r>
             <w:r>
               <w:rPr>
+                <w:b w:val="0"/>
                 <w:sz w:val="21"/>
               </w:rPr>
               <w:t>2 179 / 2 484 га (+14 %)</w:t>
@@ -1523,11 +1608,13 @@
           <w:p>
             <w:r>
               <w:rPr>
+                <w:b w:val="0"/>
                 <w:sz w:val="21"/>
               </w:rPr>
             </w:r>
             <w:r>
               <w:rPr>
+                <w:b w:val="0"/>
                 <w:sz w:val="21"/>
               </w:rPr>
               <w:t>3</w:t>
@@ -1543,11 +1630,13 @@
           <w:p>
             <w:r>
               <w:rPr>
+                <w:b w:val="0"/>
                 <w:sz w:val="21"/>
               </w:rPr>
             </w:r>
             <w:r>
               <w:rPr>
+                <w:b w:val="0"/>
                 <w:sz w:val="21"/>
               </w:rPr>
               <w:t>Свободный: было / стало / новой / ушло</w:t>
@@ -1561,11 +1650,13 @@
           <w:p>
             <w:r>
               <w:rPr>
+                <w:b w:val="0"/>
                 <w:sz w:val="21"/>
               </w:rPr>
             </w:r>
             <w:r>
               <w:rPr>
+                <w:b w:val="0"/>
                 <w:sz w:val="21"/>
               </w:rPr>
               <w:t>3 985 / 6 801 / 3 211 / 640 га</w:t>
@@ -1579,11 +1670,13 @@
           <w:p>
             <w:r>
               <w:rPr>
+                <w:b w:val="0"/>
                 <w:sz w:val="21"/>
               </w:rPr>
             </w:r>
             <w:r>
               <w:rPr>
+                <w:b w:val="0"/>
                 <w:sz w:val="21"/>
               </w:rPr>
               <w:t>4</w:t>
@@ -1599,11 +1692,13 @@
           <w:p>
             <w:r>
               <w:rPr>
+                <w:b w:val="0"/>
                 <w:sz w:val="21"/>
               </w:rPr>
             </w:r>
             <w:r>
               <w:rPr>
+                <w:b w:val="0"/>
                 <w:sz w:val="21"/>
               </w:rPr>
               <w:t>Свободный: рост зеркала</w:t>
@@ -1617,11 +1712,13 @@
           <w:p>
             <w:r>
               <w:rPr>
+                <w:b w:val="0"/>
                 <w:sz w:val="21"/>
               </w:rPr>
             </w:r>
             <w:r>
               <w:rPr>
+                <w:b w:val="0"/>
                 <w:sz w:val="21"/>
               </w:rPr>
               <w:t>+71 %</w:t>
@@ -1635,11 +1732,13 @@
           <w:p>
             <w:r>
               <w:rPr>
+                <w:b w:val="0"/>
                 <w:sz w:val="21"/>
               </w:rPr>
             </w:r>
             <w:r>
               <w:rPr>
+                <w:b w:val="0"/>
                 <w:sz w:val="21"/>
               </w:rPr>
               <w:t>4</w:t>
@@ -1655,11 +1754,13 @@
           <w:p>
             <w:r>
               <w:rPr>
+                <w:b w:val="0"/>
                 <w:sz w:val="21"/>
               </w:rPr>
             </w:r>
             <w:r>
               <w:rPr>
+                <w:b w:val="0"/>
                 <w:sz w:val="21"/>
               </w:rPr>
               <w:t>Ответ сервиса по району</w:t>
@@ -1673,11 +1774,13 @@
           <w:p>
             <w:r>
               <w:rPr>
+                <w:b w:val="0"/>
                 <w:sz w:val="21"/>
               </w:rPr>
             </w:r>
             <w:r>
               <w:rPr>
+                <w:b w:val="0"/>
                 <w:sz w:val="21"/>
               </w:rPr>
               <w:t>≈ 1 секунда</w:t>
@@ -1691,11 +1794,13 @@
           <w:p>
             <w:r>
               <w:rPr>
+                <w:b w:val="0"/>
                 <w:sz w:val="21"/>
               </w:rPr>
             </w:r>
             <w:r>
               <w:rPr>
+                <w:b w:val="0"/>
                 <w:sz w:val="21"/>
               </w:rPr>
               <w:t>4</w:t>
@@ -1711,11 +1816,13 @@
           <w:p>
             <w:r>
               <w:rPr>
+                <w:b w:val="0"/>
                 <w:sz w:val="21"/>
               </w:rPr>
             </w:r>
             <w:r>
               <w:rPr>
+                <w:b w:val="0"/>
                 <w:sz w:val="21"/>
               </w:rPr>
               <w:t>Обработка нового снимка</w:t>
@@ -1729,11 +1836,13 @@
           <w:p>
             <w:r>
               <w:rPr>
+                <w:b w:val="0"/>
                 <w:sz w:val="21"/>
               </w:rPr>
             </w:r>
             <w:r>
               <w:rPr>
+                <w:b w:val="0"/>
                 <w:sz w:val="21"/>
               </w:rPr>
               <w:t>10–20 секунд на видеокарте</w:t>
@@ -1747,11 +1856,13 @@
           <w:p>
             <w:r>
               <w:rPr>
+                <w:b w:val="0"/>
                 <w:sz w:val="21"/>
               </w:rPr>
             </w:r>
             <w:r>
               <w:rPr>
+                <w:b w:val="0"/>
                 <w:sz w:val="21"/>
               </w:rPr>
               <w:t>4</w:t>
@@ -1767,11 +1878,13 @@
           <w:p>
             <w:r>
               <w:rPr>
+                <w:b w:val="0"/>
                 <w:sz w:val="21"/>
               </w:rPr>
             </w:r>
             <w:r>
               <w:rPr>
+                <w:b w:val="0"/>
                 <w:sz w:val="21"/>
               </w:rPr>
               <w:t>Память видеокарты / сайт</w:t>
@@ -1785,11 +1898,13 @@
           <w:p>
             <w:r>
               <w:rPr>
+                <w:b w:val="0"/>
                 <w:sz w:val="21"/>
               </w:rPr>
             </w:r>
             <w:r>
               <w:rPr>
+                <w:b w:val="0"/>
                 <w:sz w:val="21"/>
               </w:rPr>
               <w:t>2–3 ГБ / без видеокарты</w:t>
@@ -1803,11 +1918,13 @@
           <w:p>
             <w:r>
               <w:rPr>
+                <w:b w:val="0"/>
                 <w:sz w:val="21"/>
               </w:rPr>
             </w:r>
             <w:r>
               <w:rPr>
+                <w:b w:val="0"/>
                 <w:sz w:val="21"/>
               </w:rPr>
               <w:t>4</w:t>
@@ -1823,11 +1940,13 @@
           <w:p>
             <w:r>
               <w:rPr>
+                <w:b w:val="0"/>
                 <w:sz w:val="21"/>
               </w:rPr>
             </w:r>
             <w:r>
               <w:rPr>
+                <w:b w:val="0"/>
                 <w:sz w:val="21"/>
               </w:rPr>
               <w:t>Автотесты</w:t>
@@ -1841,11 +1960,13 @@
           <w:p>
             <w:r>
               <w:rPr>
+                <w:b w:val="0"/>
                 <w:sz w:val="21"/>
               </w:rPr>
             </w:r>
             <w:r>
               <w:rPr>
+                <w:b w:val="0"/>
                 <w:sz w:val="21"/>
               </w:rPr>
               <w:t>22</w:t>
@@ -1859,11 +1980,13 @@
           <w:p>
             <w:r>
               <w:rPr>
+                <w:b w:val="0"/>
                 <w:sz w:val="21"/>
               </w:rPr>
             </w:r>
             <w:r>
               <w:rPr>
+                <w:b w:val="0"/>
                 <w:sz w:val="21"/>
               </w:rPr>
               <w:t>4</w:t>
@@ -1882,6 +2005,14 @@
           <w:color w:val="0A7AFF"/>
         </w:rPr>
         <w:t>5. Вопросы жюри и ответы</w:t>
+      </w:r>
+    </w:p>
+    <w:p>
+      <w:pPr>
+        <w:spacing w:after="120"/>
+      </w:pPr>
+      <w:r>
+        <w:t>На вопросы всего 2 минуты — это 2–3 вопроса, ответ не дольше 20 секунд.</w:t>
       </w:r>
     </w:p>
     <w:p>
@@ -2243,7 +2374,7 @@
         <w:pStyle w:val="ListNumber"/>
       </w:pPr>
       <w:r>
-        <w:t>Прогнать речь вслух два раза с таймером. Цель — 6 минут; если лимит 5 — убрать фразы в ⟨скобках⟩.</w:t>
+        <w:t>Прогнать речь вслух два раза с таймером. Лимит 4:00 — если не укладываетесь, убрать фразы в ⟨скобках⟩.</w:t>
       </w:r>
     </w:p>
     <w:p>

</xml_diff>

<commit_message>
Speech cut to 3:30
Co-authored-by: arena-agent <297053741+arena-agent@users.noreply.github.com>
</commit_message>
<xml_diff>
--- a/Памятка_защита.docx
+++ b/Памятка_защита.docx
@@ -257,7 +257,7 @@
                 <w:b w:val="0"/>
                 <w:sz w:val="21"/>
               </w:rPr>
-              <w:t>0:40</w:t>
+              <w:t>0:35</w:t>
             </w:r>
           </w:p>
         </w:tc>
@@ -339,7 +339,7 @@
                 <w:b w:val="0"/>
                 <w:sz w:val="21"/>
               </w:rPr>
-              <w:t>1:05</w:t>
+              <w:t>0:55</w:t>
             </w:r>
           </w:p>
         </w:tc>
@@ -421,7 +421,7 @@
                 <w:b w:val="0"/>
                 <w:sz w:val="21"/>
               </w:rPr>
-              <w:t>0:55</w:t>
+              <w:t>0:50</w:t>
             </w:r>
           </w:p>
         </w:tc>
@@ -503,7 +503,7 @@
                 <w:b w:val="0"/>
                 <w:sz w:val="21"/>
               </w:rPr>
-              <w:t>0:50</w:t>
+              <w:t>0:45</w:t>
             </w:r>
           </w:p>
         </w:tc>
@@ -585,7 +585,7 @@
                 <w:b w:val="0"/>
                 <w:sz w:val="21"/>
               </w:rPr>
-              <w:t>0:30</w:t>
+              <w:t>0:25</w:t>
             </w:r>
           </w:p>
         </w:tc>
@@ -597,7 +597,7 @@
         <w:spacing w:after="120"/>
       </w:pPr>
       <w:r>
-        <w:t>Итого 4 минуты, затем 2 минуты вопросов. Слайды листает один человек (спикер 4), остальные к ноутбуку не подходят.</w:t>
+        <w:t>Итого 3:30, затем 2 минуты вопросов. Слайды листает один человек (спикер 4), остальные к ноутбуку не подходят.</w:t>
       </w:r>
     </w:p>
     <w:p>
@@ -608,7 +608,7 @@
         <w:rPr>
           <w:color w:val="0A7AFF"/>
         </w:rPr>
-        <w:t>3. Речь — 4 минуты (+ 2 минуты вопросов)</w:t>
+        <w:t>3. Речь — 3:30 (+ 2 минуты вопросов)</w:t>
       </w:r>
     </w:p>
     <w:p>
@@ -616,7 +616,7 @@
         <w:spacing w:after="120"/>
       </w:pPr>
       <w:r>
-        <w:t>Пять человек, каждый 30–65 секунд. Фразы в ⟨скобках⟩ — резерв: убрать, если на прогоне не укладываетесь в 4:00.</w:t>
+        <w:t>Пять человек, каждый 25–55 секунд. Только суть. Прогнать с таймером: цель 3:20–3:30.</w:t>
       </w:r>
     </w:p>
     <w:p>
@@ -627,7 +627,7 @@
         <w:rPr>
           <w:color w:val="0B3D91"/>
         </w:rPr>
-        <w:t>1. Капитан — задача и данные (0:40, слайды 1–3)</w:t>
+        <w:t>1. Капитан — задача и данные (0:35, слайды 1–3)</w:t>
       </w:r>
     </w:p>
     <w:p>
@@ -643,7 +643,7 @@
         <w:spacing w:after="120"/>
       </w:pPr>
       <w:r>
-        <w:t>Когда Амур выходит из берегов, спасателям нужно за часы понять, где вода и сколько её. Наша программа берёт два спутниковых снимка — до паводка и на пике — и выдаёт три карты: вода до, вода на пике и новое затопление, с площадями в гектарах. Оценка на платформе — 0,768.</w:t>
+        <w:t>Когда Амур выходит из берегов, спасателям нужно за часы понять, где вода и сколько её. Наша программа по двум снимкам — до паводка и на пике — выдаёт три карты: вода до, вода на пике и новое затопление, с площадями в гектарах. Оценка на платформе — 0,768.</w:t>
       </w:r>
     </w:p>
     <w:p>
@@ -651,15 +651,7 @@
         <w:spacing w:after="120"/>
       </w:pPr>
       <w:r>
-        <w:t>Данные сложные: новая вода — меньше двух процентов снимка, у пяти пар из одиннадцати нет оптики, только радар, а между снимками шесть недель.</w:t>
-      </w:r>
-    </w:p>
-    <w:p>
-      <w:pPr>
-        <w:spacing w:after="120"/>
-      </w:pPr>
-      <w:r>
-        <w:t>Как мы это решили — [имя].</w:t>
+        <w:t>Данные сложные: новая вода — меньше двух процентов снимка, у пяти пар из одиннадцати нет оптики, между снимками шесть недель. Как мы это решили — [имя].</w:t>
       </w:r>
     </w:p>
     <w:p>
@@ -670,7 +662,7 @@
         <w:rPr>
           <w:color w:val="0B3D91"/>
         </w:rPr>
-        <w:t>2. Модель — как устроена (1:05, слайды 4–5)</w:t>
+        <w:t>2. Модель — как устроена (0:55, слайды 4–5)</w:t>
       </w:r>
     </w:p>
     <w:p>
@@ -678,7 +670,7 @@
         <w:spacing w:after="120"/>
       </w:pPr>
       <w:r>
-        <w:t>Простой путь — порог яркости по радару и вычесть одну карту из другой — мы проверили первым. Не работает: ветер на воде радар видит как сушу, тени гор — как воду, у оптики мешают мутная вода и облака. Ошибки у них разные — поэтому мы объединяем радар и оптику внутри одной нейросети.</w:t>
+        <w:t>Простой путь — порог яркости и вычесть одну карту из другой — не работает: ветер на воде радар видит как сушу, тени гор — как воду, оптике мешают облака. Поэтому мы объединяем радар и оптику внутри одной нейросети.</w:t>
       </w:r>
     </w:p>
     <w:p>
@@ -686,7 +678,7 @@
         <w:spacing w:after="120"/>
       </w:pPr>
       <w:r>
-        <w:t>Это U-Net с двумя энкодерами ResNet-18: один читает радар, другой — оптику, каждый видит и «до», и «пик». Сеть сама сравнивает даты, а ещё получает рельеф — высоту над рекой — и карту постоянной воды.</w:t>
+        <w:t>Это U-Net с двумя энкодерами ResNet-18: один читает радар, другой — оптику, каждый видит и «до», и «пик». Плюс рельеф — высота над рекой — и карта постоянной воды.</w:t>
       </w:r>
     </w:p>
     <w:p>
@@ -694,7 +686,7 @@
         <w:spacing w:after="120"/>
       </w:pPr>
       <w:r>
-        <w:t>Три приёма дали результат. Первый: при обучении в половине случаев мы прятали оптику — без неё сеть работает штатно. Второй: в функцию потерь зашили правила — новая вода только внутри воды пика и вне воды «до». Третий: новое затопление предсказывает отдельная голова, а не разность карт. Почему это важно — [имя].</w:t>
+        <w:t>Три приёма дали результат. При обучении в половине случаев прятали оптику — без неё сеть работает штатно. В функцию потерь зашили правила: новая вода только внутри воды пика и вне воды «до». И новое затопление предсказывает отдельная голова, а не разность карт. Почему — [имя].</w:t>
       </w:r>
     </w:p>
     <w:p>
@@ -705,7 +697,7 @@
         <w:rPr>
           <w:color w:val="0B3D91"/>
         </w:rPr>
-        <w:t>3. Проверка — откуда знаем, что работает (0:55, слайды 6–7)</w:t>
+        <w:t>3. Проверка — откуда знаем, что работает (0:50, слайды 6–7)</w:t>
       </w:r>
     </w:p>
     <w:p>
@@ -713,7 +705,7 @@
         <w:spacing w:after="120"/>
       </w:pPr>
       <w:r>
-        <w:t>Проверяли честно: паводок 2021 года на Зее в обучение не давали. На нём новое затопление 0,53, вода на пике 0,57, вода до — 1,0. Пороги подбирали только на нём. По всем данным у нас 0,758, платформа дала 0,768.</w:t>
+        <w:t>Проверяли честно: паводок 2021 года на Зее в обучение не давали. На нём новое затопление 0,53, вода на пике 0,57, вода до — 1,0; пороги подбирали только на нём. По всем данным у нас 0,758, платформа дала 0,768.</w:t>
       </w:r>
     </w:p>
     <w:p>
@@ -721,15 +713,7 @@
         <w:spacing w:after="120"/>
       </w:pPr>
       <w:r>
-        <w:t>Затем мы проверили сам эталон и нашли ошибки. У пяти пар из одиннадцати в масках нет реки: в Константиновке 30 гектаров воды при реке в 5 436. По Зее таблица и маска расходятся на 14 процентов. И затопление в эталоне не равно «пик минус до». Поэтому новую воду мы учим отдельно, а не считаем арифметикой.</w:t>
-      </w:r>
-    </w:p>
-    <w:p>
-      <w:pPr>
-        <w:spacing w:after="120"/>
-      </w:pPr>
-      <w:r>
-        <w:t>Что получает пользователь — [имя].</w:t>
+        <w:t>Затем проверили сам эталон и нашли ошибки: у пяти пар из одиннадцати в масках нет реки — в Константиновке 30 гектаров воды при реке в 5 436; по Зее таблица и маска расходятся на 14 процентов; и затопление не равно «пик минус до». Поэтому новую воду мы учим отдельно, а не считаем арифметикой. Что получает пользователь — [имя].</w:t>
       </w:r>
     </w:p>
     <w:p>
@@ -740,7 +724,7 @@
         <w:rPr>
           <w:color w:val="0B3D91"/>
         </w:rPr>
-        <w:t>4. Сервис — что получает пользователь (0:50, слайды 8–9)</w:t>
+        <w:t>4. Сервис — что получает пользователь (0:45, слайды 8–9)</w:t>
       </w:r>
     </w:p>
     <w:p>
@@ -748,7 +732,7 @@
         <w:spacing w:after="120"/>
       </w:pPr>
       <w:r>
-        <w:t>Дежурный ЦУКС обводит район, выбирает даты — и через секунду видит четыре слоя: вода до, на пике, прирост, убыль, со шторкой для сравнения. Рядом отчёт: Свободный — новой воды 3 211 гектаров, ушло 640, зеркало выросло на 71 процент, ⟨разбивка по типам поверхности⟩. Выгрузка в GeoJSON, GeoTIFF, CSV — и всё то же через REST API.</w:t>
+        <w:t>Дежурный ЦУКС обводит район, выбирает даты — через секунду видит четыре слоя: вода до, на пике, прирост, убыль, со шторкой для сравнения. Рядом отчёт: Свободный — новой воды 3 211 гектаров, ушло 640, зеркало выросло на 71 процент. Выгрузка в GeoJSON, GeoTIFF, CSV — и всё то же через REST API.</w:t>
       </w:r>
     </w:p>
     <w:p>
@@ -756,15 +740,7 @@
         <w:spacing w:after="120"/>
       </w:pPr>
       <w:r>
-        <w:t>Новый пролёт спутника — маски за 10–20 секунд, пересчитывается только разница. Запуск одной командой docker compose up, модели хватает 2–3 гигабайт видеопамяти, ⟨версии и контрольные суммы зафиксированы, 22 теста⟩.</w:t>
-      </w:r>
-    </w:p>
-    <w:p>
-      <w:pPr>
-        <w:spacing w:after="120"/>
-      </w:pPr>
-      <w:r>
-        <w:t>Где границы — [имя].</w:t>
+        <w:t>Новый пролёт спутника — маски за 10–20 секунд, пересчитывается только разница. Запуск одной командой docker compose up, модели хватает 2–3 гигабайт видеопамяти. Где границы — [имя].</w:t>
       </w:r>
     </w:p>
     <w:p>
@@ -775,7 +751,7 @@
         <w:rPr>
           <w:color w:val="0B3D91"/>
         </w:rPr>
-        <w:t>5. Итог (0:30, слайд 10)</w:t>
+        <w:t>5. Итог (0:25, слайд 10)</w:t>
       </w:r>
     </w:p>
     <w:p>
@@ -783,7 +759,7 @@
         <w:spacing w:after="120"/>
       </w:pPr>
       <w:r>
-        <w:t>Не видим воду под деревьями, на широких поймах завышаем, угол съёмки радара не учитываем. Дальше — серия снимков вместо пары, больше паводков в обучение, отчёты по бассейнам рек.</w:t>
+        <w:t>Не видим воду под деревьями, на широких поймах завышаем, угол съёмки радара не учитываем. Дальше — серия снимков вместо пары и отчёты по бассейнам рек.</w:t>
       </w:r>
     </w:p>
     <w:p>
@@ -2374,7 +2350,7 @@
         <w:pStyle w:val="ListNumber"/>
       </w:pPr>
       <w:r>
-        <w:t>Прогнать речь вслух два раза с таймером. Лимит 4:00 — если не укладываетесь, убрать фразы в ⟨скобках⟩.</w:t>
+        <w:t>Прогнать речь вслух два раза с таймером. Лимит 3:30 — прогнать с таймером минимум дважды.</w:t>
       </w:r>
     </w:p>
     <w:p>

</xml_diff>

<commit_message>
Speech 3:30 with model rationale; fix pretrain wording
Co-authored-by: arena-agent <297053741+arena-agent@users.noreply.github.com>
</commit_message>
<xml_diff>
--- a/Памятка_защита.docx
+++ b/Памятка_защита.docx
@@ -257,7 +257,7 @@
                 <w:b w:val="0"/>
                 <w:sz w:val="21"/>
               </w:rPr>
-              <w:t>0:35</w:t>
+              <w:t>0:30</w:t>
             </w:r>
           </w:p>
         </w:tc>
@@ -339,7 +339,7 @@
                 <w:b w:val="0"/>
                 <w:sz w:val="21"/>
               </w:rPr>
-              <w:t>0:55</w:t>
+              <w:t>1:20</w:t>
             </w:r>
           </w:p>
         </w:tc>
@@ -421,7 +421,7 @@
                 <w:b w:val="0"/>
                 <w:sz w:val="21"/>
               </w:rPr>
-              <w:t>0:50</w:t>
+              <w:t>0:40</w:t>
             </w:r>
           </w:p>
         </w:tc>
@@ -503,7 +503,7 @@
                 <w:b w:val="0"/>
                 <w:sz w:val="21"/>
               </w:rPr>
-              <w:t>0:45</w:t>
+              <w:t>0:40</w:t>
             </w:r>
           </w:p>
         </w:tc>
@@ -585,7 +585,7 @@
                 <w:b w:val="0"/>
                 <w:sz w:val="21"/>
               </w:rPr>
-              <w:t>0:25</w:t>
+              <w:t>0:20</w:t>
             </w:r>
           </w:p>
         </w:tc>
@@ -608,7 +608,7 @@
         <w:rPr>
           <w:color w:val="0A7AFF"/>
         </w:rPr>
-        <w:t>3. Речь — 3:30 (+ 2 минуты вопросов)</w:t>
+        <w:t>3. Речь — 3:30 (+ 2 минуты вопросов), акцент на модели</w:t>
       </w:r>
     </w:p>
     <w:p>
@@ -616,7 +616,7 @@
         <w:spacing w:after="120"/>
       </w:pPr>
       <w:r>
-        <w:t>Пять человек, каждый 25–55 секунд. Только суть. Прогнать с таймером: цель 3:20–3:30.</w:t>
+        <w:t>Пять человек. Больше всего времени — у спикера 2: почему выбрана именно такая модель. Прогнать с таймером: цель 3:20–3:30.</w:t>
       </w:r>
     </w:p>
     <w:p>
@@ -627,7 +627,7 @@
         <w:rPr>
           <w:color w:val="0B3D91"/>
         </w:rPr>
-        <w:t>1. Капитан — задача и данные (0:35, слайды 1–3)</w:t>
+        <w:t>1. Капитан — задача и данные (0:30, слайды 1–3)</w:t>
       </w:r>
     </w:p>
     <w:p>
@@ -651,7 +651,7 @@
         <w:spacing w:after="120"/>
       </w:pPr>
       <w:r>
-        <w:t>Данные сложные: новая вода — меньше двух процентов снимка, у пяти пар из одиннадцати нет оптики, между снимками шесть недель. Как мы это решили — [имя].</w:t>
+        <w:t>Данные сложные: новая вода — меньше двух процентов снимка, у пяти пар из одиннадцати нет оптики, между снимками шесть недель. Почему под такие данные мы выбрали именно такую модель — [имя].</w:t>
       </w:r>
     </w:p>
     <w:p>
@@ -662,7 +662,7 @@
         <w:rPr>
           <w:color w:val="0B3D91"/>
         </w:rPr>
-        <w:t>2. Модель — как устроена (0:55, слайды 4–5)</w:t>
+        <w:t>2. Модель — почему именно такая (1:20, слайды 4–5)</w:t>
       </w:r>
     </w:p>
     <w:p>
@@ -670,7 +670,7 @@
         <w:spacing w:after="120"/>
       </w:pPr>
       <w:r>
-        <w:t>Простой путь — порог яркости и вычесть одну карту из другой — не работает: ветер на воде радар видит как сушу, тени гор — как воду, оптике мешают облака. Поэтому мы объединяем радар и оптику внутри одной нейросети.</w:t>
+        <w:t>Слайд 4. Начали мы не с нейросети, а с простого: порог яркости по радару и вычесть карту «до» из карты «пик» — так устроен и эталон организаторов. И проверили, где это ломается. Радар: ветровая рябь, тени гор и мокрая пашня выглядят как вода. Оптика: мутная вода и тени облаков — и её нет у половины пар. А разность карт за шесть недель ловит сезон, а не паводок. Готовые сети из статей тоже не подошли: обучены на других регионах и без снимка «до».</w:t>
       </w:r>
     </w:p>
     <w:p>
@@ -678,7 +678,7 @@
         <w:spacing w:after="120"/>
       </w:pPr>
       <w:r>
-        <w:t>Это U-Net с двумя энкодерами ResNet-18: один читает радар, другой — оптику, каждый видит и «до», и «пик». Плюс рельеф — высота над рекой — и карта постоянной воды.</w:t>
+        <w:t>Слайд 5. Поэтому собрали свою. Основа — U-Net: она рисует карту по пикселям, устойчива к шуму радара и достаточно маленькая, чтобы обучиться на одиннадцати парах за минуты. Два энкодера ResNet-18, потому что радар и оптика — физически разные сигналы, каждая ветка учит свои признаки. Оптическую стартовали с весов SSL4EO, предобученных на миллионах снимков Sentinel-2; радарную — с нуля, готовых весов для неё нет. Сеть сиамская: одна и та же ветка смотрит и на «до», и на «пик», и сравнивает даты внутри, на каждом масштабе. Рельеф и постоянная вода идут подсказкой, а не жёстким фильтром.</w:t>
       </w:r>
     </w:p>
     <w:p>
@@ -686,7 +686,7 @@
         <w:spacing w:after="120"/>
       </w:pPr>
       <w:r>
-        <w:t>Три приёма дали результат. При обучении в половине случаев прятали оптику — без неё сеть работает штатно. В функцию потерь зашили правила: новая вода только внутри воды пика и вне воды «до». И новое затопление предсказывает отдельная голова, а не разность карт. Почему — [имя].</w:t>
+        <w:t>Три приёма. При обучении в половине случаев прятали оптику — без неё сеть работает штатно. В функцию потерь зашили правила: новая вода только внутри воды пика и вне воды «до». И новое затопление предсказывает отдельная голова, а не разность карт. Почему это важно — [имя].</w:t>
       </w:r>
     </w:p>
     <w:p>
@@ -697,7 +697,7 @@
         <w:rPr>
           <w:color w:val="0B3D91"/>
         </w:rPr>
-        <w:t>3. Проверка — откуда знаем, что работает (0:50, слайды 6–7)</w:t>
+        <w:t>3. Проверка — откуда знаем, что работает (0:40, слайды 6–7)</w:t>
       </w:r>
     </w:p>
     <w:p>
@@ -713,7 +713,7 @@
         <w:spacing w:after="120"/>
       </w:pPr>
       <w:r>
-        <w:t>Затем проверили сам эталон и нашли ошибки: у пяти пар из одиннадцати в масках нет реки — в Константиновке 30 гектаров воды при реке в 5 436; по Зее таблица и маска расходятся на 14 процентов; и затопление не равно «пик минус до». Поэтому новую воду мы учим отдельно, а не считаем арифметикой. Что получает пользователь — [имя].</w:t>
+        <w:t>Проверили и эталон: у пяти пар из одиннадцати в масках нет реки, по Зее таблица и маска расходятся на 14 процентов, и затопление не равно «пик минус до». Поэтому новую воду учим отдельно, а не считаем арифметикой. Что получает пользователь — [имя].</w:t>
       </w:r>
     </w:p>
     <w:p>
@@ -724,7 +724,7 @@
         <w:rPr>
           <w:color w:val="0B3D91"/>
         </w:rPr>
-        <w:t>4. Сервис — что получает пользователь (0:45, слайды 8–9)</w:t>
+        <w:t>4. Сервис — что получает пользователь (0:40, слайды 8–9)</w:t>
       </w:r>
     </w:p>
     <w:p>
@@ -732,15 +732,7 @@
         <w:spacing w:after="120"/>
       </w:pPr>
       <w:r>
-        <w:t>Дежурный ЦУКС обводит район, выбирает даты — через секунду видит четыре слоя: вода до, на пике, прирост, убыль, со шторкой для сравнения. Рядом отчёт: Свободный — новой воды 3 211 гектаров, ушло 640, зеркало выросло на 71 процент. Выгрузка в GeoJSON, GeoTIFF, CSV — и всё то же через REST API.</w:t>
-      </w:r>
-    </w:p>
-    <w:p>
-      <w:pPr>
-        <w:spacing w:after="120"/>
-      </w:pPr>
-      <w:r>
-        <w:t>Новый пролёт спутника — маски за 10–20 секунд, пересчитывается только разница. Запуск одной командой docker compose up, модели хватает 2–3 гигабайт видеопамяти. Где границы — [имя].</w:t>
+        <w:t>Дежурный ЦУКС обводит район, выбирает даты — через секунду видит четыре слоя: вода до, на пике, прирост, убыль, со шторкой для сравнения. Отчёт по Свободному: новой воды 3 211 гектаров, ушло 640, зеркало выросло на 71 процент. Выгрузка в GeoJSON, GeoTIFF, CSV и через REST API. Новый снимок — маски за 10–20 секунд. Запуск одной командой, модели хватает 2–3 гигабайт видеопамяти. Где границы — [имя].</w:t>
       </w:r>
     </w:p>
     <w:p>
@@ -751,7 +743,7 @@
         <w:rPr>
           <w:color w:val="0B3D91"/>
         </w:rPr>
-        <w:t>5. Итог (0:25, слайд 10)</w:t>
+        <w:t>5. Итог (0:20, слайд 10)</w:t>
       </w:r>
     </w:p>
     <w:p>
@@ -2102,7 +2094,7 @@
         <w:t>Почему такая простая сеть, а не трансформер?</w:t>
       </w:r>
       <w:r>
-        <w:t xml:space="preserve"> У нас всего 11 пар снимков. Большим моделям нечему учиться, а наша учится за минуты и работает на дешёвой видеокарте. Готовую предобученную сеть для радара мы пробовали — вышло хуже, чем учить с нуля.</w:t>
+        <w:t xml:space="preserve"> У нас всего 11 пар снимков. Большим моделям нечему учиться, а наша учится за минуты и работает на дешёвой видеокарте. Для оптики взяли предобученные веса SSL4EO, для радара подходящих готовых весов нет — учили с нуля.</w:t>
       </w:r>
     </w:p>
     <w:p>

</xml_diff>